<commit_message>
Fallen-Nummern in den Materialien, Version 1.16.0
- D.warn({ titel, fallen }, …): Warnkasten nennt am Ende „Abitur-Fallen: P… Titel · …“
  (Liste aus app/js/data/fallen.js, eine Quelle für App, Profil und Materialien)
- Fallen eingetragen in den Warnkästen der Handreichungen DS01–DS15 und der Merkblätter M02–M09
  (Turing DS16 und Dreh-Hinweise der Videoplanung bewusst ohne)
- Merkblatt M12 (Abi-Spickzettel): neuer Abschnitt „C Die zehn Abitur-Fallen“
- materials/pdf: nur die betroffenen Handreichungen, Merkblätter und M12 neu erzeugt
- Doku: STYLEGUIDE, MATERIALIEN, FALLEN, ROADMAP, ENTSCHEIDUNGEN

Co-Authored-By: Claude Opus 5.5 <noreply@anthropic.com>
Claude-Session: https://claude.ai/code/session_01PWJnmHrzHBQwQfBgXDCh3C
</commit_message>
<xml_diff>
--- a/materials/pdf/original/DS01_Lehrkraft_Ein-Automat-hoert-zu.docx
+++ b/materials/pdf/original/DS01_Lehrkraft_Ein-Automat-hoert-zu.docx
@@ -3643,6 +3643,82 @@
                 <w:szCs w:val="22"/>
               </w:rPr>
               <w:t xml:space="preserve"> Im Abitur werden Automaten vollständig angegeben; der Fehlerzustand darf nur mit Hinweis weggelassen werden (Ergänzende Hinweise 2025, Abschnitt 12).</w:t>
+            </w:r>
+          </w:p>
+          <w:p>
+            <w:pPr>
+              <w:spacing w:after="0" w:before="100"/>
+            </w:pPr>
+            <w:r>
+              <w:rPr>
+                <w:rFonts w:ascii="Calibri" w:cs="Calibri" w:eastAsia="Calibri" w:hAnsi="Calibri"/>
+                <w:b/>
+                <w:bCs/>
+                <w:color w:val="A83232"/>
+                <w:sz w:val="17"/>
+                <w:szCs w:val="17"/>
+              </w:rPr>
+              <w:t xml:space="preserve">Abitur-Fallen: </w:t>
+            </w:r>
+            <w:r>
+              <w:rPr>
+                <w:rFonts w:ascii="Calibri" w:cs="Calibri" w:eastAsia="Calibri" w:hAnsi="Calibri"/>
+                <w:b/>
+                <w:bCs/>
+                <w:color w:val="A83232"/>
+                <w:sz w:val="17"/>
+                <w:szCs w:val="17"/>
+              </w:rPr>
+              <w:t xml:space="preserve">P1 </w:t>
+            </w:r>
+            <w:r>
+              <w:rPr>
+                <w:rFonts w:ascii="Calibri" w:cs="Calibri" w:eastAsia="Calibri" w:hAnsi="Calibri"/>
+                <w:color w:val="5B6770"/>
+                <w:sz w:val="17"/>
+                <w:szCs w:val="17"/>
+              </w:rPr>
+              <w:t xml:space="preserve">Automat unvollständig, Fehlerzustand-Hinweis fehlt</w:t>
+            </w:r>
+            <w:r>
+              <w:rPr>
+                <w:rFonts w:ascii="Calibri" w:cs="Calibri" w:eastAsia="Calibri" w:hAnsi="Calibri"/>
+                <w:b/>
+                <w:bCs/>
+                <w:color w:val="A83232"/>
+                <w:sz w:val="17"/>
+                <w:szCs w:val="17"/>
+              </w:rPr>
+              <w:t xml:space="preserve">  ·  P2 </w:t>
+            </w:r>
+            <w:r>
+              <w:rPr>
+                <w:rFonts w:ascii="Calibri" w:cs="Calibri" w:eastAsia="Calibri" w:hAnsi="Calibri"/>
+                <w:color w:val="5B6770"/>
+                <w:sz w:val="17"/>
+                <w:szCs w:val="17"/>
+              </w:rPr>
+              <w:t xml:space="preserve">Akzeptanz falsch entschieden</w:t>
+            </w:r>
+            <w:r>
+              <w:rPr>
+                <w:rFonts w:ascii="Calibri" w:cs="Calibri" w:eastAsia="Calibri" w:hAnsi="Calibri"/>
+                <w:b/>
+                <w:bCs/>
+                <w:color w:val="A83232"/>
+                <w:sz w:val="17"/>
+                <w:szCs w:val="17"/>
+              </w:rPr>
+              <w:t xml:space="preserve">  ·  P3 </w:t>
+            </w:r>
+            <w:r>
+              <w:rPr>
+                <w:rFonts w:ascii="Calibri" w:cs="Calibri" w:eastAsia="Calibri" w:hAnsi="Calibri"/>
+                <w:color w:val="5B6770"/>
+                <w:sz w:val="17"/>
+                <w:szCs w:val="17"/>
+              </w:rPr>
+              <w:t xml:space="preserve">Entwurf nicht an Grenzfällen getestet</w:t>
             </w:r>
           </w:p>
         </w:tc>

</xml_diff>